<commit_message>
fromativa banco de dados
</commit_message>
<xml_diff>
--- a/2°_SEMESTRE/BANCO_DE_DADOS/atividades_aula/exercicio_blog_alex_monica/MONICA COTRIM MANFRINATO.docx
+++ b/2°_SEMESTRE/BANCO_DE_DADOS/atividades_aula/exercicio_blog_alex_monica/MONICA COTRIM MANFRINATO.docx
@@ -38,8 +38,8 @@
           <w:szCs w:val="24"/>
         </w:rPr>
         <w:drawing>
-          <wp:inline distT="0" distB="0" distL="0" distR="0" wp14:anchorId="463697D1" wp14:editId="7865388A">
-            <wp:extent cx="3886200" cy="2531240"/>
+          <wp:inline distT="0" distB="0" distL="0" distR="0" wp14:anchorId="66BEA76C" wp14:editId="51ACCE4B">
+            <wp:extent cx="4838700" cy="3426464"/>
             <wp:effectExtent l="0" t="0" r="0" b="2540"/>
             <wp:docPr id="1" name="Imagem 1"/>
             <wp:cNvGraphicFramePr>
@@ -61,7 +61,7 @@
                   <pic:spPr>
                     <a:xfrm>
                       <a:off x="0" y="0"/>
-                      <a:ext cx="3903086" cy="2542239"/>
+                      <a:ext cx="4844017" cy="3430229"/>
                     </a:xfrm>
                     <a:prstGeom prst="rect">
                       <a:avLst/>
@@ -112,6 +112,15 @@
           <w:szCs w:val="24"/>
         </w:rPr>
       </w:pPr>
+    </w:p>
+    <w:p>
+      <w:pPr>
+        <w:rPr>
+          <w:rFonts w:ascii="Arial" w:hAnsi="Arial" w:cs="Arial"/>
+          <w:sz w:val="24"/>
+          <w:szCs w:val="24"/>
+        </w:rPr>
+      </w:pPr>
       <w:r>
         <w:rPr>
           <w:rFonts w:ascii="Arial" w:hAnsi="Arial" w:cs="Arial"/>
@@ -119,10 +128,10 @@
           <w:szCs w:val="24"/>
         </w:rPr>
         <w:drawing>
-          <wp:inline distT="0" distB="0" distL="0" distR="0" wp14:anchorId="2362AFF8" wp14:editId="292AD1EF">
-            <wp:extent cx="5400040" cy="4707255"/>
-            <wp:effectExtent l="0" t="0" r="0" b="0"/>
-            <wp:docPr id="6" name="Imagem 6"/>
+          <wp:inline distT="0" distB="0" distL="0" distR="0" wp14:anchorId="12035A61" wp14:editId="31CA0D5D">
+            <wp:extent cx="4448175" cy="3787016"/>
+            <wp:effectExtent l="0" t="0" r="0" b="4445"/>
+            <wp:docPr id="2" name="Imagem 2"/>
             <wp:cNvGraphicFramePr>
               <a:graphicFrameLocks xmlns:a="http://schemas.openxmlformats.org/drawingml/2006/main" noChangeAspect="1"/>
             </wp:cNvGraphicFramePr>
@@ -142,7 +151,7 @@
                   <pic:spPr>
                     <a:xfrm>
                       <a:off x="0" y="0"/>
-                      <a:ext cx="5400040" cy="4707255"/>
+                      <a:ext cx="4473407" cy="3808498"/>
                     </a:xfrm>
                     <a:prstGeom prst="rect">
                       <a:avLst/>
@@ -154,68 +163,762 @@
           </wp:inline>
         </w:drawing>
       </w:r>
+    </w:p>
+    <w:p>
+      <w:pPr>
+        <w:rPr>
+          <w:rFonts w:ascii="Arial" w:hAnsi="Arial" w:cs="Arial"/>
+          <w:sz w:val="24"/>
+          <w:szCs w:val="24"/>
+        </w:rPr>
+      </w:pPr>
+    </w:p>
+    <w:p>
+      <w:pPr>
+        <w:rPr>
+          <w:rFonts w:ascii="Arial" w:hAnsi="Arial" w:cs="Arial"/>
+          <w:b/>
+          <w:i/>
+          <w:sz w:val="24"/>
+          <w:szCs w:val="24"/>
+        </w:rPr>
+      </w:pPr>
+      <w:r>
+        <w:rPr>
+          <w:rFonts w:ascii="Arial" w:hAnsi="Arial" w:cs="Arial"/>
+          <w:b/>
+          <w:i/>
+          <w:sz w:val="24"/>
+          <w:szCs w:val="24"/>
+        </w:rPr>
+        <w:lastRenderedPageBreak/>
+        <w:t>Modelo físico:</w:t>
+      </w:r>
+    </w:p>
+    <w:p>
+      <w:pPr>
+        <w:rPr>
+          <w:rFonts w:ascii="Arial" w:hAnsi="Arial" w:cs="Arial"/>
+          <w:sz w:val="24"/>
+          <w:szCs w:val="24"/>
+        </w:rPr>
+      </w:pPr>
+    </w:p>
+    <w:p>
+      <w:pPr>
+        <w:rPr>
+          <w:rFonts w:ascii="Arial" w:hAnsi="Arial" w:cs="Arial"/>
+          <w:sz w:val="24"/>
+          <w:szCs w:val="24"/>
+        </w:rPr>
+      </w:pPr>
+      <w:r>
+        <w:rPr>
+          <w:rFonts w:ascii="Arial" w:hAnsi="Arial" w:cs="Arial"/>
+          <w:sz w:val="24"/>
+          <w:szCs w:val="24"/>
+        </w:rPr>
+        <w:t xml:space="preserve">CREATE DATABASE </w:t>
+      </w:r>
+      <w:proofErr w:type="spellStart"/>
+      <w:r>
+        <w:rPr>
+          <w:rFonts w:ascii="Arial" w:hAnsi="Arial" w:cs="Arial"/>
+          <w:sz w:val="24"/>
+          <w:szCs w:val="24"/>
+        </w:rPr>
+        <w:t>db_blog</w:t>
+      </w:r>
+      <w:proofErr w:type="spellEnd"/>
+      <w:r>
+        <w:rPr>
+          <w:rFonts w:ascii="Arial" w:hAnsi="Arial" w:cs="Arial"/>
+          <w:sz w:val="24"/>
+          <w:szCs w:val="24"/>
+        </w:rPr>
+        <w:t>;</w:t>
+      </w:r>
+    </w:p>
+    <w:p>
+      <w:pPr>
+        <w:rPr>
+          <w:rFonts w:ascii="Arial" w:hAnsi="Arial" w:cs="Arial"/>
+          <w:sz w:val="24"/>
+          <w:szCs w:val="24"/>
+        </w:rPr>
+      </w:pPr>
+    </w:p>
+    <w:p>
+      <w:pPr>
+        <w:rPr>
+          <w:rFonts w:ascii="Arial" w:hAnsi="Arial" w:cs="Arial"/>
+          <w:sz w:val="24"/>
+          <w:szCs w:val="24"/>
+        </w:rPr>
+      </w:pPr>
+      <w:r>
+        <w:rPr>
+          <w:rFonts w:ascii="Arial" w:hAnsi="Arial" w:cs="Arial"/>
+          <w:sz w:val="24"/>
+          <w:szCs w:val="24"/>
+        </w:rPr>
+        <w:t xml:space="preserve">USE </w:t>
+      </w:r>
+      <w:proofErr w:type="spellStart"/>
+      <w:r>
+        <w:rPr>
+          <w:rFonts w:ascii="Arial" w:hAnsi="Arial" w:cs="Arial"/>
+          <w:sz w:val="24"/>
+          <w:szCs w:val="24"/>
+        </w:rPr>
+        <w:t>db_blog</w:t>
+      </w:r>
+      <w:proofErr w:type="spellEnd"/>
+      <w:r>
+        <w:rPr>
+          <w:rFonts w:ascii="Arial" w:hAnsi="Arial" w:cs="Arial"/>
+          <w:sz w:val="24"/>
+          <w:szCs w:val="24"/>
+        </w:rPr>
+        <w:t>;</w:t>
+      </w:r>
+    </w:p>
+    <w:p>
+      <w:pPr>
+        <w:rPr>
+          <w:rFonts w:ascii="Arial" w:hAnsi="Arial" w:cs="Arial"/>
+          <w:sz w:val="24"/>
+          <w:szCs w:val="24"/>
+        </w:rPr>
+      </w:pPr>
+      <w:r>
+        <w:rPr>
+          <w:rFonts w:ascii="Arial" w:hAnsi="Arial" w:cs="Arial"/>
+          <w:sz w:val="24"/>
+          <w:szCs w:val="24"/>
+        </w:rPr>
+        <w:t xml:space="preserve">CREATE TABLE </w:t>
+      </w:r>
+      <w:proofErr w:type="spellStart"/>
+      <w:proofErr w:type="gramStart"/>
+      <w:r>
+        <w:rPr>
+          <w:rFonts w:ascii="Arial" w:hAnsi="Arial" w:cs="Arial"/>
+          <w:sz w:val="24"/>
+          <w:szCs w:val="24"/>
+        </w:rPr>
+        <w:t>comentario</w:t>
+      </w:r>
+      <w:proofErr w:type="spellEnd"/>
+      <w:r>
+        <w:rPr>
+          <w:rFonts w:ascii="Arial" w:hAnsi="Arial" w:cs="Arial"/>
+          <w:sz w:val="24"/>
+          <w:szCs w:val="24"/>
+        </w:rPr>
+        <w:t>(</w:t>
+      </w:r>
+      <w:proofErr w:type="gramEnd"/>
+    </w:p>
+    <w:p>
+      <w:pPr>
+        <w:rPr>
+          <w:rFonts w:ascii="Arial" w:hAnsi="Arial" w:cs="Arial"/>
+          <w:sz w:val="24"/>
+          <w:szCs w:val="24"/>
+        </w:rPr>
+      </w:pPr>
+      <w:proofErr w:type="spellStart"/>
+      <w:r>
+        <w:rPr>
+          <w:rFonts w:ascii="Arial" w:hAnsi="Arial" w:cs="Arial"/>
+          <w:sz w:val="24"/>
+          <w:szCs w:val="24"/>
+        </w:rPr>
+        <w:t>id_comentario</w:t>
+      </w:r>
+      <w:proofErr w:type="spellEnd"/>
+      <w:r>
+        <w:rPr>
+          <w:rFonts w:ascii="Arial" w:hAnsi="Arial" w:cs="Arial"/>
+          <w:sz w:val="24"/>
+          <w:szCs w:val="24"/>
+        </w:rPr>
+        <w:t xml:space="preserve"> INTEGER PRIMARY KEY NOT </w:t>
+      </w:r>
+      <w:proofErr w:type="gramStart"/>
+      <w:r>
+        <w:rPr>
+          <w:rFonts w:ascii="Arial" w:hAnsi="Arial" w:cs="Arial"/>
+          <w:sz w:val="24"/>
+          <w:szCs w:val="24"/>
+        </w:rPr>
+        <w:t>NULL ,</w:t>
+      </w:r>
+      <w:proofErr w:type="gramEnd"/>
+    </w:p>
+    <w:p>
+      <w:pPr>
+        <w:rPr>
+          <w:rFonts w:ascii="Arial" w:hAnsi="Arial" w:cs="Arial"/>
+          <w:sz w:val="24"/>
+          <w:szCs w:val="24"/>
+        </w:rPr>
+      </w:pPr>
+      <w:proofErr w:type="spellStart"/>
+      <w:r>
+        <w:rPr>
+          <w:rFonts w:ascii="Arial" w:hAnsi="Arial" w:cs="Arial"/>
+          <w:sz w:val="24"/>
+          <w:szCs w:val="24"/>
+        </w:rPr>
+        <w:t>id_autor</w:t>
+      </w:r>
+      <w:proofErr w:type="spellEnd"/>
+      <w:r>
+        <w:rPr>
+          <w:rFonts w:ascii="Arial" w:hAnsi="Arial" w:cs="Arial"/>
+          <w:sz w:val="24"/>
+          <w:szCs w:val="24"/>
+        </w:rPr>
+        <w:t xml:space="preserve"> INTEGER NOT NULL,</w:t>
+      </w:r>
+    </w:p>
+    <w:p>
+      <w:pPr>
+        <w:rPr>
+          <w:rFonts w:ascii="Arial" w:hAnsi="Arial" w:cs="Arial"/>
+          <w:sz w:val="24"/>
+          <w:szCs w:val="24"/>
+        </w:rPr>
+      </w:pPr>
+      <w:proofErr w:type="spellStart"/>
+      <w:r>
+        <w:rPr>
+          <w:rFonts w:ascii="Arial" w:hAnsi="Arial" w:cs="Arial"/>
+          <w:sz w:val="24"/>
+          <w:szCs w:val="24"/>
+        </w:rPr>
+        <w:t>id_postagem</w:t>
+      </w:r>
+      <w:proofErr w:type="spellEnd"/>
+      <w:r>
+        <w:rPr>
+          <w:rFonts w:ascii="Arial" w:hAnsi="Arial" w:cs="Arial"/>
+          <w:sz w:val="24"/>
+          <w:szCs w:val="24"/>
+        </w:rPr>
+        <w:t xml:space="preserve"> INTEGER NOT NULL,</w:t>
+      </w:r>
+    </w:p>
+    <w:p>
+      <w:pPr>
+        <w:rPr>
+          <w:rFonts w:ascii="Arial" w:hAnsi="Arial" w:cs="Arial"/>
+          <w:sz w:val="24"/>
+          <w:szCs w:val="24"/>
+        </w:rPr>
+      </w:pPr>
+      <w:proofErr w:type="spellStart"/>
+      <w:r>
+        <w:rPr>
+          <w:rFonts w:ascii="Arial" w:hAnsi="Arial" w:cs="Arial"/>
+          <w:sz w:val="24"/>
+          <w:szCs w:val="24"/>
+        </w:rPr>
+        <w:t>conteudo</w:t>
+      </w:r>
+      <w:proofErr w:type="spellEnd"/>
+      <w:r>
+        <w:rPr>
+          <w:rFonts w:ascii="Arial" w:hAnsi="Arial" w:cs="Arial"/>
+          <w:sz w:val="24"/>
+          <w:szCs w:val="24"/>
+        </w:rPr>
+        <w:t xml:space="preserve"> </w:t>
+      </w:r>
+      <w:proofErr w:type="gramStart"/>
+      <w:r>
+        <w:rPr>
+          <w:rFonts w:ascii="Arial" w:hAnsi="Arial" w:cs="Arial"/>
+          <w:sz w:val="24"/>
+          <w:szCs w:val="24"/>
+        </w:rPr>
+        <w:t>VARCHAR(</w:t>
+      </w:r>
+      <w:proofErr w:type="gramEnd"/>
+      <w:r>
+        <w:rPr>
+          <w:rFonts w:ascii="Arial" w:hAnsi="Arial" w:cs="Arial"/>
+          <w:sz w:val="24"/>
+          <w:szCs w:val="24"/>
+        </w:rPr>
+        <w:t>500),</w:t>
+      </w:r>
+    </w:p>
+    <w:p>
+      <w:pPr>
+        <w:rPr>
+          <w:rFonts w:ascii="Arial" w:hAnsi="Arial" w:cs="Arial"/>
+          <w:sz w:val="24"/>
+          <w:szCs w:val="24"/>
+        </w:rPr>
+      </w:pPr>
+      <w:proofErr w:type="spellStart"/>
+      <w:r>
+        <w:rPr>
+          <w:rFonts w:ascii="Arial" w:hAnsi="Arial" w:cs="Arial"/>
+          <w:sz w:val="24"/>
+          <w:szCs w:val="24"/>
+        </w:rPr>
+        <w:t>data_comentario</w:t>
+      </w:r>
+      <w:proofErr w:type="spellEnd"/>
+      <w:r>
+        <w:rPr>
+          <w:rFonts w:ascii="Arial" w:hAnsi="Arial" w:cs="Arial"/>
+          <w:sz w:val="24"/>
+          <w:szCs w:val="24"/>
+        </w:rPr>
+        <w:t xml:space="preserve"> DATE,</w:t>
+      </w:r>
+    </w:p>
+    <w:p>
+      <w:pPr>
+        <w:rPr>
+          <w:rFonts w:ascii="Arial" w:hAnsi="Arial" w:cs="Arial"/>
+          <w:sz w:val="24"/>
+          <w:szCs w:val="24"/>
+        </w:rPr>
+      </w:pPr>
+      <w:r>
+        <w:rPr>
+          <w:rFonts w:ascii="Arial" w:hAnsi="Arial" w:cs="Arial"/>
+          <w:sz w:val="24"/>
+          <w:szCs w:val="24"/>
+        </w:rPr>
+        <w:t>hora TIME</w:t>
+      </w:r>
+    </w:p>
+    <w:p>
+      <w:pPr>
+        <w:rPr>
+          <w:rFonts w:ascii="Arial" w:hAnsi="Arial" w:cs="Arial"/>
+          <w:sz w:val="24"/>
+          <w:szCs w:val="24"/>
+        </w:rPr>
+      </w:pPr>
+      <w:r>
+        <w:rPr>
+          <w:rFonts w:ascii="Arial" w:hAnsi="Arial" w:cs="Arial"/>
+          <w:sz w:val="24"/>
+          <w:szCs w:val="24"/>
+        </w:rPr>
+        <w:t>);</w:t>
+      </w:r>
+    </w:p>
+    <w:p>
+      <w:pPr>
+        <w:rPr>
+          <w:rFonts w:ascii="Arial" w:hAnsi="Arial" w:cs="Arial"/>
+          <w:sz w:val="24"/>
+          <w:szCs w:val="24"/>
+        </w:rPr>
+      </w:pPr>
+    </w:p>
+    <w:p>
+      <w:pPr>
+        <w:rPr>
+          <w:rFonts w:ascii="Arial" w:hAnsi="Arial" w:cs="Arial"/>
+          <w:sz w:val="24"/>
+          <w:szCs w:val="24"/>
+        </w:rPr>
+      </w:pPr>
+      <w:r>
+        <w:rPr>
+          <w:rFonts w:ascii="Arial" w:hAnsi="Arial" w:cs="Arial"/>
+          <w:sz w:val="24"/>
+          <w:szCs w:val="24"/>
+        </w:rPr>
+        <w:t xml:space="preserve">CREATE TABLE </w:t>
+      </w:r>
+      <w:proofErr w:type="gramStart"/>
+      <w:r>
+        <w:rPr>
+          <w:rFonts w:ascii="Arial" w:hAnsi="Arial" w:cs="Arial"/>
+          <w:sz w:val="24"/>
+          <w:szCs w:val="24"/>
+        </w:rPr>
+        <w:t>autor(</w:t>
+      </w:r>
+      <w:proofErr w:type="gramEnd"/>
+    </w:p>
+    <w:p>
+      <w:pPr>
+        <w:rPr>
+          <w:rFonts w:ascii="Arial" w:hAnsi="Arial" w:cs="Arial"/>
+          <w:sz w:val="24"/>
+          <w:szCs w:val="24"/>
+        </w:rPr>
+      </w:pPr>
+      <w:proofErr w:type="spellStart"/>
+      <w:r>
+        <w:rPr>
+          <w:rFonts w:ascii="Arial" w:hAnsi="Arial" w:cs="Arial"/>
+          <w:sz w:val="24"/>
+          <w:szCs w:val="24"/>
+        </w:rPr>
+        <w:t>id_autor</w:t>
+      </w:r>
+      <w:proofErr w:type="spellEnd"/>
+      <w:r>
+        <w:rPr>
+          <w:rFonts w:ascii="Arial" w:hAnsi="Arial" w:cs="Arial"/>
+          <w:sz w:val="24"/>
+          <w:szCs w:val="24"/>
+        </w:rPr>
+        <w:t xml:space="preserve"> INTEGER PRIMARY KEY NOT NULL,</w:t>
+      </w:r>
+    </w:p>
+    <w:p>
+      <w:pPr>
+        <w:rPr>
+          <w:rFonts w:ascii="Arial" w:hAnsi="Arial" w:cs="Arial"/>
+          <w:sz w:val="24"/>
+          <w:szCs w:val="24"/>
+        </w:rPr>
+      </w:pPr>
+      <w:r>
+        <w:rPr>
+          <w:rFonts w:ascii="Arial" w:hAnsi="Arial" w:cs="Arial"/>
+          <w:sz w:val="24"/>
+          <w:szCs w:val="24"/>
+        </w:rPr>
+        <w:t xml:space="preserve">nome </w:t>
+      </w:r>
+      <w:proofErr w:type="gramStart"/>
+      <w:r>
+        <w:rPr>
+          <w:rFonts w:ascii="Arial" w:hAnsi="Arial" w:cs="Arial"/>
+          <w:sz w:val="24"/>
+          <w:szCs w:val="24"/>
+        </w:rPr>
+        <w:t>VARCHAR(</w:t>
+      </w:r>
+      <w:proofErr w:type="gramEnd"/>
+      <w:r>
+        <w:rPr>
+          <w:rFonts w:ascii="Arial" w:hAnsi="Arial" w:cs="Arial"/>
+          <w:sz w:val="24"/>
+          <w:szCs w:val="24"/>
+        </w:rPr>
+        <w:t>50),</w:t>
+      </w:r>
+    </w:p>
+    <w:p>
+      <w:pPr>
+        <w:rPr>
+          <w:rFonts w:ascii="Arial" w:hAnsi="Arial" w:cs="Arial"/>
+          <w:sz w:val="24"/>
+          <w:szCs w:val="24"/>
+        </w:rPr>
+      </w:pPr>
+      <w:proofErr w:type="spellStart"/>
+      <w:r>
+        <w:rPr>
+          <w:rFonts w:ascii="Arial" w:hAnsi="Arial" w:cs="Arial"/>
+          <w:sz w:val="24"/>
+          <w:szCs w:val="24"/>
+        </w:rPr>
+        <w:t>email</w:t>
+      </w:r>
+      <w:proofErr w:type="spellEnd"/>
+      <w:r>
+        <w:rPr>
+          <w:rFonts w:ascii="Arial" w:hAnsi="Arial" w:cs="Arial"/>
+          <w:sz w:val="24"/>
+          <w:szCs w:val="24"/>
+        </w:rPr>
+        <w:t xml:space="preserve"> </w:t>
+      </w:r>
+      <w:proofErr w:type="gramStart"/>
+      <w:r>
+        <w:rPr>
+          <w:rFonts w:ascii="Arial" w:hAnsi="Arial" w:cs="Arial"/>
+          <w:sz w:val="24"/>
+          <w:szCs w:val="24"/>
+        </w:rPr>
+        <w:t>VARCHAR(</w:t>
+      </w:r>
+      <w:proofErr w:type="gramEnd"/>
+      <w:r>
+        <w:rPr>
+          <w:rFonts w:ascii="Arial" w:hAnsi="Arial" w:cs="Arial"/>
+          <w:sz w:val="24"/>
+          <w:szCs w:val="24"/>
+        </w:rPr>
+        <w:t>100)</w:t>
+      </w:r>
+    </w:p>
+    <w:p>
+      <w:pPr>
+        <w:rPr>
+          <w:rFonts w:ascii="Arial" w:hAnsi="Arial" w:cs="Arial"/>
+          <w:sz w:val="24"/>
+          <w:szCs w:val="24"/>
+        </w:rPr>
+      </w:pPr>
+      <w:r>
+        <w:rPr>
+          <w:rFonts w:ascii="Arial" w:hAnsi="Arial" w:cs="Arial"/>
+          <w:sz w:val="24"/>
+          <w:szCs w:val="24"/>
+        </w:rPr>
+        <w:t>);</w:t>
+      </w:r>
+    </w:p>
+    <w:p>
+      <w:pPr>
+        <w:rPr>
+          <w:rFonts w:ascii="Arial" w:hAnsi="Arial" w:cs="Arial"/>
+          <w:sz w:val="24"/>
+          <w:szCs w:val="24"/>
+        </w:rPr>
+      </w:pPr>
+    </w:p>
+    <w:p>
+      <w:pPr>
+        <w:rPr>
+          <w:rFonts w:ascii="Arial" w:hAnsi="Arial" w:cs="Arial"/>
+          <w:sz w:val="24"/>
+          <w:szCs w:val="24"/>
+        </w:rPr>
+      </w:pPr>
+      <w:r>
+        <w:rPr>
+          <w:rFonts w:ascii="Arial" w:hAnsi="Arial" w:cs="Arial"/>
+          <w:sz w:val="24"/>
+          <w:szCs w:val="24"/>
+        </w:rPr>
+        <w:t xml:space="preserve">CREATE TABLE </w:t>
+      </w:r>
+      <w:proofErr w:type="gramStart"/>
+      <w:r>
+        <w:rPr>
+          <w:rFonts w:ascii="Arial" w:hAnsi="Arial" w:cs="Arial"/>
+          <w:sz w:val="24"/>
+          <w:szCs w:val="24"/>
+        </w:rPr>
+        <w:t>postagem(</w:t>
+      </w:r>
+      <w:proofErr w:type="gramEnd"/>
+    </w:p>
+    <w:p>
+      <w:pPr>
+        <w:rPr>
+          <w:rFonts w:ascii="Arial" w:hAnsi="Arial" w:cs="Arial"/>
+          <w:sz w:val="24"/>
+          <w:szCs w:val="24"/>
+        </w:rPr>
+      </w:pPr>
+      <w:proofErr w:type="spellStart"/>
+      <w:r>
+        <w:rPr>
+          <w:rFonts w:ascii="Arial" w:hAnsi="Arial" w:cs="Arial"/>
+          <w:sz w:val="24"/>
+          <w:szCs w:val="24"/>
+        </w:rPr>
+        <w:t>id_autor</w:t>
+      </w:r>
+      <w:proofErr w:type="spellEnd"/>
+      <w:r>
+        <w:rPr>
+          <w:rFonts w:ascii="Arial" w:hAnsi="Arial" w:cs="Arial"/>
+          <w:sz w:val="24"/>
+          <w:szCs w:val="24"/>
+        </w:rPr>
+        <w:t xml:space="preserve"> INTEGER NOT NULL,</w:t>
+      </w:r>
+    </w:p>
+    <w:p>
+      <w:pPr>
+        <w:rPr>
+          <w:rFonts w:ascii="Arial" w:hAnsi="Arial" w:cs="Arial"/>
+          <w:sz w:val="24"/>
+          <w:szCs w:val="24"/>
+        </w:rPr>
+      </w:pPr>
+      <w:proofErr w:type="spellStart"/>
+      <w:r>
+        <w:rPr>
+          <w:rFonts w:ascii="Arial" w:hAnsi="Arial" w:cs="Arial"/>
+          <w:sz w:val="24"/>
+          <w:szCs w:val="24"/>
+        </w:rPr>
+        <w:t>id_postagem</w:t>
+      </w:r>
+      <w:proofErr w:type="spellEnd"/>
+      <w:r>
+        <w:rPr>
+          <w:rFonts w:ascii="Arial" w:hAnsi="Arial" w:cs="Arial"/>
+          <w:sz w:val="24"/>
+          <w:szCs w:val="24"/>
+        </w:rPr>
+        <w:t xml:space="preserve"> INTEGER NOT NULL,</w:t>
+      </w:r>
+    </w:p>
+    <w:p>
+      <w:pPr>
+        <w:rPr>
+          <w:rFonts w:ascii="Arial" w:hAnsi="Arial" w:cs="Arial"/>
+          <w:sz w:val="24"/>
+          <w:szCs w:val="24"/>
+        </w:rPr>
+      </w:pPr>
+      <w:proofErr w:type="spellStart"/>
+      <w:r>
+        <w:rPr>
+          <w:rFonts w:ascii="Arial" w:hAnsi="Arial" w:cs="Arial"/>
+          <w:sz w:val="24"/>
+          <w:szCs w:val="24"/>
+        </w:rPr>
+        <w:t>conteudo</w:t>
+      </w:r>
+      <w:proofErr w:type="spellEnd"/>
+      <w:r>
+        <w:rPr>
+          <w:rFonts w:ascii="Arial" w:hAnsi="Arial" w:cs="Arial"/>
+          <w:sz w:val="24"/>
+          <w:szCs w:val="24"/>
+        </w:rPr>
+        <w:t xml:space="preserve"> </w:t>
+      </w:r>
+      <w:proofErr w:type="gramStart"/>
+      <w:r>
+        <w:rPr>
+          <w:rFonts w:ascii="Arial" w:hAnsi="Arial" w:cs="Arial"/>
+          <w:sz w:val="24"/>
+          <w:szCs w:val="24"/>
+        </w:rPr>
+        <w:t>VARCHAR(</w:t>
+      </w:r>
+      <w:proofErr w:type="gramEnd"/>
+      <w:r>
+        <w:rPr>
+          <w:rFonts w:ascii="Arial" w:hAnsi="Arial" w:cs="Arial"/>
+          <w:sz w:val="24"/>
+          <w:szCs w:val="24"/>
+        </w:rPr>
+        <w:t>500),</w:t>
+      </w:r>
+    </w:p>
+    <w:p>
+      <w:pPr>
+        <w:rPr>
+          <w:rFonts w:ascii="Arial" w:hAnsi="Arial" w:cs="Arial"/>
+          <w:sz w:val="24"/>
+          <w:szCs w:val="24"/>
+        </w:rPr>
+      </w:pPr>
+      <w:proofErr w:type="spellStart"/>
+      <w:r>
+        <w:rPr>
+          <w:rFonts w:ascii="Arial" w:hAnsi="Arial" w:cs="Arial"/>
+          <w:sz w:val="24"/>
+          <w:szCs w:val="24"/>
+        </w:rPr>
+        <w:t>data_postagem</w:t>
+      </w:r>
+      <w:proofErr w:type="spellEnd"/>
+      <w:r>
+        <w:rPr>
+          <w:rFonts w:ascii="Arial" w:hAnsi="Arial" w:cs="Arial"/>
+          <w:sz w:val="24"/>
+          <w:szCs w:val="24"/>
+        </w:rPr>
+        <w:t xml:space="preserve"> DATE,</w:t>
+      </w:r>
+    </w:p>
+    <w:p>
+      <w:pPr>
+        <w:rPr>
+          <w:rFonts w:ascii="Arial" w:hAnsi="Arial" w:cs="Arial"/>
+          <w:sz w:val="24"/>
+          <w:szCs w:val="24"/>
+        </w:rPr>
+      </w:pPr>
+      <w:r>
+        <w:rPr>
+          <w:rFonts w:ascii="Arial" w:hAnsi="Arial" w:cs="Arial"/>
+          <w:sz w:val="24"/>
+          <w:szCs w:val="24"/>
+        </w:rPr>
+        <w:t>hora TIME,</w:t>
+      </w:r>
+    </w:p>
+    <w:p>
+      <w:pPr>
+        <w:rPr>
+          <w:rFonts w:ascii="Arial" w:hAnsi="Arial" w:cs="Arial"/>
+          <w:sz w:val="24"/>
+          <w:szCs w:val="24"/>
+        </w:rPr>
+      </w:pPr>
+      <w:proofErr w:type="spellStart"/>
+      <w:r>
+        <w:rPr>
+          <w:rFonts w:ascii="Arial" w:hAnsi="Arial" w:cs="Arial"/>
+          <w:sz w:val="24"/>
+          <w:szCs w:val="24"/>
+        </w:rPr>
+        <w:t>titulo</w:t>
+      </w:r>
+      <w:proofErr w:type="spellEnd"/>
+      <w:r>
+        <w:rPr>
+          <w:rFonts w:ascii="Arial" w:hAnsi="Arial" w:cs="Arial"/>
+          <w:sz w:val="24"/>
+          <w:szCs w:val="24"/>
+        </w:rPr>
+        <w:t xml:space="preserve"> </w:t>
+      </w:r>
+      <w:proofErr w:type="gramStart"/>
+      <w:r>
+        <w:rPr>
+          <w:rFonts w:ascii="Arial" w:hAnsi="Arial" w:cs="Arial"/>
+          <w:sz w:val="24"/>
+          <w:szCs w:val="24"/>
+        </w:rPr>
+        <w:t>VARCHAR(</w:t>
+      </w:r>
+      <w:proofErr w:type="gramEnd"/>
+      <w:r>
+        <w:rPr>
+          <w:rFonts w:ascii="Arial" w:hAnsi="Arial" w:cs="Arial"/>
+          <w:sz w:val="24"/>
+          <w:szCs w:val="24"/>
+        </w:rPr>
+        <w:t>50)</w:t>
+      </w:r>
+    </w:p>
+    <w:p>
+      <w:pPr>
+        <w:rPr>
+          <w:rFonts w:ascii="Arial" w:hAnsi="Arial" w:cs="Arial"/>
+          <w:sz w:val="24"/>
+          <w:szCs w:val="24"/>
+        </w:rPr>
+      </w:pPr>
+      <w:r>
+        <w:rPr>
+          <w:rFonts w:ascii="Arial" w:hAnsi="Arial" w:cs="Arial"/>
+          <w:sz w:val="24"/>
+          <w:szCs w:val="24"/>
+        </w:rPr>
+        <w:t>);</w:t>
+      </w:r>
       <w:bookmarkStart w:id="0" w:name="_GoBack"/>
       <w:bookmarkEnd w:id="0"/>
-    </w:p>
-    <w:p>
-      <w:pPr>
-        <w:rPr>
-          <w:rFonts w:ascii="Arial" w:hAnsi="Arial" w:cs="Arial"/>
-          <w:sz w:val="24"/>
-          <w:szCs w:val="24"/>
-        </w:rPr>
-      </w:pPr>
-    </w:p>
-    <w:p>
-      <w:pPr>
-        <w:rPr>
-          <w:rFonts w:ascii="Arial" w:hAnsi="Arial" w:cs="Arial"/>
-          <w:sz w:val="24"/>
-          <w:szCs w:val="24"/>
-        </w:rPr>
-      </w:pPr>
-    </w:p>
-    <w:p>
-      <w:pPr>
-        <w:rPr>
-          <w:rFonts w:ascii="Arial" w:hAnsi="Arial" w:cs="Arial"/>
-          <w:b/>
-          <w:i/>
-          <w:sz w:val="24"/>
-          <w:szCs w:val="24"/>
-        </w:rPr>
-      </w:pPr>
-      <w:r>
-        <w:rPr>
-          <w:rFonts w:ascii="Arial" w:hAnsi="Arial" w:cs="Arial"/>
-          <w:b/>
-          <w:i/>
-          <w:sz w:val="24"/>
-          <w:szCs w:val="24"/>
-        </w:rPr>
-        <w:lastRenderedPageBreak/>
-        <w:t>Modelo físico:</w:t>
-      </w:r>
-    </w:p>
-    <w:p>
-      <w:pPr>
-        <w:rPr>
-          <w:rFonts w:ascii="Arial" w:hAnsi="Arial" w:cs="Arial"/>
-          <w:b/>
-          <w:i/>
-          <w:sz w:val="24"/>
-          <w:szCs w:val="24"/>
-        </w:rPr>
-      </w:pPr>
-    </w:p>
-    <w:p>
-      <w:pPr>
-        <w:rPr>
-          <w:rFonts w:ascii="Arial" w:hAnsi="Arial" w:cs="Arial"/>
-          <w:sz w:val="24"/>
-          <w:szCs w:val="24"/>
-        </w:rPr>
-      </w:pPr>
     </w:p>
     <w:sectPr>
       <w:pgSz w:w="11906" w:h="16838"/>

</xml_diff>

<commit_message>
finalização exercicio banco de dados
</commit_message>
<xml_diff>
--- a/2°_SEMESTRE/BANCO_DE_DADOS/atividades_aula/exercicio_blog_alex_monica/MONICA COTRIM MANFRINATO.docx
+++ b/2°_SEMESTRE/BANCO_DE_DADOS/atividades_aula/exercicio_blog_alex_monica/MONICA COTRIM MANFRINATO.docx
@@ -38,9 +38,9 @@
           <w:szCs w:val="24"/>
         </w:rPr>
         <w:drawing>
-          <wp:inline distT="0" distB="0" distL="0" distR="0" wp14:anchorId="66BEA76C" wp14:editId="51ACCE4B">
-            <wp:extent cx="4838700" cy="3426464"/>
-            <wp:effectExtent l="0" t="0" r="0" b="2540"/>
+          <wp:inline distT="0" distB="0" distL="0" distR="0" wp14:anchorId="596A5739" wp14:editId="32F11CE2">
+            <wp:extent cx="4936067" cy="3176171"/>
+            <wp:effectExtent l="0" t="0" r="0" b="5715"/>
             <wp:docPr id="1" name="Imagem 1"/>
             <wp:cNvGraphicFramePr>
               <a:graphicFrameLocks xmlns:a="http://schemas.openxmlformats.org/drawingml/2006/main" noChangeAspect="1"/>
@@ -61,7 +61,7 @@
                   <pic:spPr>
                     <a:xfrm>
                       <a:off x="0" y="0"/>
-                      <a:ext cx="4844017" cy="3430229"/>
+                      <a:ext cx="4939152" cy="3178156"/>
                     </a:xfrm>
                     <a:prstGeom prst="rect">
                       <a:avLst/>
@@ -128,10 +128,10 @@
           <w:szCs w:val="24"/>
         </w:rPr>
         <w:drawing>
-          <wp:inline distT="0" distB="0" distL="0" distR="0" wp14:anchorId="12035A61" wp14:editId="31CA0D5D">
-            <wp:extent cx="4448175" cy="3787016"/>
-            <wp:effectExtent l="0" t="0" r="0" b="4445"/>
-            <wp:docPr id="2" name="Imagem 2"/>
+          <wp:inline distT="0" distB="0" distL="0" distR="0" wp14:anchorId="7FA7A435" wp14:editId="6A2CD016">
+            <wp:extent cx="4284295" cy="3572933"/>
+            <wp:effectExtent l="0" t="0" r="2540" b="8890"/>
+            <wp:docPr id="5" name="Imagem 5"/>
             <wp:cNvGraphicFramePr>
               <a:graphicFrameLocks xmlns:a="http://schemas.openxmlformats.org/drawingml/2006/main" noChangeAspect="1"/>
             </wp:cNvGraphicFramePr>
@@ -151,7 +151,7 @@
                   <pic:spPr>
                     <a:xfrm>
                       <a:off x="0" y="0"/>
-                      <a:ext cx="4473407" cy="3808498"/>
+                      <a:ext cx="4290386" cy="3578013"/>
                     </a:xfrm>
                     <a:prstGeom prst="rect">
                       <a:avLst/>
@@ -177,6 +177,15 @@
       <w:pPr>
         <w:rPr>
           <w:rFonts w:ascii="Arial" w:hAnsi="Arial" w:cs="Arial"/>
+          <w:sz w:val="24"/>
+          <w:szCs w:val="24"/>
+        </w:rPr>
+      </w:pPr>
+    </w:p>
+    <w:p>
+      <w:pPr>
+        <w:rPr>
+          <w:rFonts w:ascii="Arial" w:hAnsi="Arial" w:cs="Arial"/>
           <w:b/>
           <w:i/>
           <w:sz w:val="24"/>
@@ -247,15 +256,6 @@
           <w:szCs w:val="24"/>
         </w:rPr>
       </w:pPr>
-    </w:p>
-    <w:p>
-      <w:pPr>
-        <w:rPr>
-          <w:rFonts w:ascii="Arial" w:hAnsi="Arial" w:cs="Arial"/>
-          <w:sz w:val="24"/>
-          <w:szCs w:val="24"/>
-        </w:rPr>
-      </w:pPr>
       <w:r>
         <w:rPr>
           <w:rFonts w:ascii="Arial" w:hAnsi="Arial" w:cs="Arial"/>
@@ -344,7 +344,88 @@
           <w:sz w:val="24"/>
           <w:szCs w:val="24"/>
         </w:rPr>
-        <w:t xml:space="preserve"> INTEGER PRIMARY KEY NOT </w:t>
+        <w:t xml:space="preserve"> INTEGER,</w:t>
+      </w:r>
+    </w:p>
+    <w:p>
+      <w:pPr>
+        <w:rPr>
+          <w:rFonts w:ascii="Arial" w:hAnsi="Arial" w:cs="Arial"/>
+          <w:sz w:val="24"/>
+          <w:szCs w:val="24"/>
+        </w:rPr>
+      </w:pPr>
+      <w:proofErr w:type="spellStart"/>
+      <w:r>
+        <w:rPr>
+          <w:rFonts w:ascii="Arial" w:hAnsi="Arial" w:cs="Arial"/>
+          <w:sz w:val="24"/>
+          <w:szCs w:val="24"/>
+        </w:rPr>
+        <w:t>id_autor</w:t>
+      </w:r>
+      <w:proofErr w:type="spellEnd"/>
+      <w:r>
+        <w:rPr>
+          <w:rFonts w:ascii="Arial" w:hAnsi="Arial" w:cs="Arial"/>
+          <w:sz w:val="24"/>
+          <w:szCs w:val="24"/>
+        </w:rPr>
+        <w:t xml:space="preserve"> INTEGER,</w:t>
+      </w:r>
+    </w:p>
+    <w:p>
+      <w:pPr>
+        <w:rPr>
+          <w:rFonts w:ascii="Arial" w:hAnsi="Arial" w:cs="Arial"/>
+          <w:sz w:val="24"/>
+          <w:szCs w:val="24"/>
+        </w:rPr>
+      </w:pPr>
+      <w:proofErr w:type="spellStart"/>
+      <w:r>
+        <w:rPr>
+          <w:rFonts w:ascii="Arial" w:hAnsi="Arial" w:cs="Arial"/>
+          <w:sz w:val="24"/>
+          <w:szCs w:val="24"/>
+        </w:rPr>
+        <w:t>id_postagem</w:t>
+      </w:r>
+      <w:proofErr w:type="spellEnd"/>
+      <w:r>
+        <w:rPr>
+          <w:rFonts w:ascii="Arial" w:hAnsi="Arial" w:cs="Arial"/>
+          <w:sz w:val="24"/>
+          <w:szCs w:val="24"/>
+        </w:rPr>
+        <w:t xml:space="preserve"> INTEGER,</w:t>
+      </w:r>
+    </w:p>
+    <w:p>
+      <w:pPr>
+        <w:rPr>
+          <w:rFonts w:ascii="Arial" w:hAnsi="Arial" w:cs="Arial"/>
+          <w:sz w:val="24"/>
+          <w:szCs w:val="24"/>
+        </w:rPr>
+      </w:pPr>
+      <w:proofErr w:type="spellStart"/>
+      <w:r>
+        <w:rPr>
+          <w:rFonts w:ascii="Arial" w:hAnsi="Arial" w:cs="Arial"/>
+          <w:sz w:val="24"/>
+          <w:szCs w:val="24"/>
+        </w:rPr>
+        <w:t>conteudo</w:t>
+      </w:r>
+      <w:proofErr w:type="spellEnd"/>
+      <w:r>
+        <w:rPr>
+          <w:rFonts w:ascii="Arial" w:hAnsi="Arial" w:cs="Arial"/>
+          <w:sz w:val="24"/>
+          <w:szCs w:val="24"/>
+        </w:rPr>
+        <w:t xml:space="preserve"> </w:t>
       </w:r>
       <w:proofErr w:type="gramStart"/>
       <w:r>
@@ -353,9 +434,114 @@
           <w:sz w:val="24"/>
           <w:szCs w:val="24"/>
         </w:rPr>
-        <w:t>NULL ,</w:t>
+        <w:t>VARCHAR(</w:t>
       </w:r>
       <w:proofErr w:type="gramEnd"/>
+      <w:r>
+        <w:rPr>
+          <w:rFonts w:ascii="Arial" w:hAnsi="Arial" w:cs="Arial"/>
+          <w:sz w:val="24"/>
+          <w:szCs w:val="24"/>
+        </w:rPr>
+        <w:t>500),</w:t>
+      </w:r>
+    </w:p>
+    <w:p>
+      <w:pPr>
+        <w:rPr>
+          <w:rFonts w:ascii="Arial" w:hAnsi="Arial" w:cs="Arial"/>
+          <w:sz w:val="24"/>
+          <w:szCs w:val="24"/>
+        </w:rPr>
+      </w:pPr>
+      <w:proofErr w:type="spellStart"/>
+      <w:r>
+        <w:rPr>
+          <w:rFonts w:ascii="Arial" w:hAnsi="Arial" w:cs="Arial"/>
+          <w:sz w:val="24"/>
+          <w:szCs w:val="24"/>
+        </w:rPr>
+        <w:t>data_comentario</w:t>
+      </w:r>
+      <w:proofErr w:type="spellEnd"/>
+      <w:r>
+        <w:rPr>
+          <w:rFonts w:ascii="Arial" w:hAnsi="Arial" w:cs="Arial"/>
+          <w:sz w:val="24"/>
+          <w:szCs w:val="24"/>
+        </w:rPr>
+        <w:t xml:space="preserve"> DATE,</w:t>
+      </w:r>
+    </w:p>
+    <w:p>
+      <w:pPr>
+        <w:rPr>
+          <w:rFonts w:ascii="Arial" w:hAnsi="Arial" w:cs="Arial"/>
+          <w:sz w:val="24"/>
+          <w:szCs w:val="24"/>
+        </w:rPr>
+      </w:pPr>
+      <w:r>
+        <w:rPr>
+          <w:rFonts w:ascii="Arial" w:hAnsi="Arial" w:cs="Arial"/>
+          <w:sz w:val="24"/>
+          <w:szCs w:val="24"/>
+        </w:rPr>
+        <w:t>hora TIME</w:t>
+      </w:r>
+    </w:p>
+    <w:p>
+      <w:pPr>
+        <w:rPr>
+          <w:rFonts w:ascii="Arial" w:hAnsi="Arial" w:cs="Arial"/>
+          <w:sz w:val="24"/>
+          <w:szCs w:val="24"/>
+        </w:rPr>
+      </w:pPr>
+      <w:r>
+        <w:rPr>
+          <w:rFonts w:ascii="Arial" w:hAnsi="Arial" w:cs="Arial"/>
+          <w:sz w:val="24"/>
+          <w:szCs w:val="24"/>
+        </w:rPr>
+        <w:t>);</w:t>
+      </w:r>
+    </w:p>
+    <w:p>
+      <w:pPr>
+        <w:rPr>
+          <w:rFonts w:ascii="Arial" w:hAnsi="Arial" w:cs="Arial"/>
+          <w:sz w:val="24"/>
+          <w:szCs w:val="24"/>
+        </w:rPr>
+      </w:pPr>
+    </w:p>
+    <w:p>
+      <w:pPr>
+        <w:rPr>
+          <w:rFonts w:ascii="Arial" w:hAnsi="Arial" w:cs="Arial"/>
+          <w:sz w:val="24"/>
+          <w:szCs w:val="24"/>
+        </w:rPr>
+      </w:pPr>
+      <w:r>
+        <w:rPr>
+          <w:rFonts w:ascii="Arial" w:hAnsi="Arial" w:cs="Arial"/>
+          <w:sz w:val="24"/>
+          <w:szCs w:val="24"/>
+        </w:rPr>
+        <w:t xml:space="preserve">CREATE TABLE </w:t>
+      </w:r>
+      <w:proofErr w:type="gramStart"/>
+      <w:r>
+        <w:rPr>
+          <w:rFonts w:ascii="Arial" w:hAnsi="Arial" w:cs="Arial"/>
+          <w:sz w:val="24"/>
+          <w:szCs w:val="24"/>
+        </w:rPr>
+        <w:t>autor(</w:t>
+      </w:r>
+      <w:proofErr w:type="gramEnd"/>
     </w:p>
     <w:p>
       <w:pPr>
@@ -381,8 +567,141 @@
           <w:sz w:val="24"/>
           <w:szCs w:val="24"/>
         </w:rPr>
-        <w:t xml:space="preserve"> INTEGER NOT NULL,</w:t>
-      </w:r>
+        <w:t xml:space="preserve"> INTEGER,</w:t>
+      </w:r>
+    </w:p>
+    <w:p>
+      <w:pPr>
+        <w:rPr>
+          <w:rFonts w:ascii="Arial" w:hAnsi="Arial" w:cs="Arial"/>
+          <w:sz w:val="24"/>
+          <w:szCs w:val="24"/>
+        </w:rPr>
+      </w:pPr>
+      <w:r>
+        <w:rPr>
+          <w:rFonts w:ascii="Arial" w:hAnsi="Arial" w:cs="Arial"/>
+          <w:sz w:val="24"/>
+          <w:szCs w:val="24"/>
+        </w:rPr>
+        <w:t xml:space="preserve">nome </w:t>
+      </w:r>
+      <w:proofErr w:type="gramStart"/>
+      <w:r>
+        <w:rPr>
+          <w:rFonts w:ascii="Arial" w:hAnsi="Arial" w:cs="Arial"/>
+          <w:sz w:val="24"/>
+          <w:szCs w:val="24"/>
+        </w:rPr>
+        <w:t>VARCHAR(</w:t>
+      </w:r>
+      <w:proofErr w:type="gramEnd"/>
+      <w:r>
+        <w:rPr>
+          <w:rFonts w:ascii="Arial" w:hAnsi="Arial" w:cs="Arial"/>
+          <w:sz w:val="24"/>
+          <w:szCs w:val="24"/>
+        </w:rPr>
+        <w:t>50),</w:t>
+      </w:r>
+    </w:p>
+    <w:p>
+      <w:pPr>
+        <w:rPr>
+          <w:rFonts w:ascii="Arial" w:hAnsi="Arial" w:cs="Arial"/>
+          <w:sz w:val="24"/>
+          <w:szCs w:val="24"/>
+        </w:rPr>
+      </w:pPr>
+      <w:proofErr w:type="spellStart"/>
+      <w:r>
+        <w:rPr>
+          <w:rFonts w:ascii="Arial" w:hAnsi="Arial" w:cs="Arial"/>
+          <w:sz w:val="24"/>
+          <w:szCs w:val="24"/>
+        </w:rPr>
+        <w:t>email</w:t>
+      </w:r>
+      <w:proofErr w:type="spellEnd"/>
+      <w:r>
+        <w:rPr>
+          <w:rFonts w:ascii="Arial" w:hAnsi="Arial" w:cs="Arial"/>
+          <w:sz w:val="24"/>
+          <w:szCs w:val="24"/>
+        </w:rPr>
+        <w:t xml:space="preserve"> </w:t>
+      </w:r>
+      <w:proofErr w:type="gramStart"/>
+      <w:r>
+        <w:rPr>
+          <w:rFonts w:ascii="Arial" w:hAnsi="Arial" w:cs="Arial"/>
+          <w:sz w:val="24"/>
+          <w:szCs w:val="24"/>
+        </w:rPr>
+        <w:t>VARCHAR(</w:t>
+      </w:r>
+      <w:proofErr w:type="gramEnd"/>
+      <w:r>
+        <w:rPr>
+          <w:rFonts w:ascii="Arial" w:hAnsi="Arial" w:cs="Arial"/>
+          <w:sz w:val="24"/>
+          <w:szCs w:val="24"/>
+        </w:rPr>
+        <w:t>100)</w:t>
+      </w:r>
+    </w:p>
+    <w:p>
+      <w:pPr>
+        <w:rPr>
+          <w:rFonts w:ascii="Arial" w:hAnsi="Arial" w:cs="Arial"/>
+          <w:sz w:val="24"/>
+          <w:szCs w:val="24"/>
+        </w:rPr>
+      </w:pPr>
+      <w:r>
+        <w:rPr>
+          <w:rFonts w:ascii="Arial" w:hAnsi="Arial" w:cs="Arial"/>
+          <w:sz w:val="24"/>
+          <w:szCs w:val="24"/>
+        </w:rPr>
+        <w:t>);</w:t>
+      </w:r>
+    </w:p>
+    <w:p>
+      <w:pPr>
+        <w:rPr>
+          <w:rFonts w:ascii="Arial" w:hAnsi="Arial" w:cs="Arial"/>
+          <w:sz w:val="24"/>
+          <w:szCs w:val="24"/>
+        </w:rPr>
+      </w:pPr>
+    </w:p>
+    <w:p>
+      <w:pPr>
+        <w:rPr>
+          <w:rFonts w:ascii="Arial" w:hAnsi="Arial" w:cs="Arial"/>
+          <w:sz w:val="24"/>
+          <w:szCs w:val="24"/>
+        </w:rPr>
+      </w:pPr>
+      <w:r>
+        <w:rPr>
+          <w:rFonts w:ascii="Arial" w:hAnsi="Arial" w:cs="Arial"/>
+          <w:sz w:val="24"/>
+          <w:szCs w:val="24"/>
+        </w:rPr>
+        <w:t xml:space="preserve">CREATE TABLE </w:t>
+      </w:r>
+      <w:proofErr w:type="gramStart"/>
+      <w:r>
+        <w:rPr>
+          <w:rFonts w:ascii="Arial" w:hAnsi="Arial" w:cs="Arial"/>
+          <w:sz w:val="24"/>
+          <w:szCs w:val="24"/>
+        </w:rPr>
+        <w:t>postagem(</w:t>
+      </w:r>
+      <w:proofErr w:type="gramEnd"/>
     </w:p>
     <w:p>
       <w:pPr>
@@ -408,150 +727,8 @@
           <w:sz w:val="24"/>
           <w:szCs w:val="24"/>
         </w:rPr>
-        <w:t xml:space="preserve"> INTEGER NOT NULL,</w:t>
-      </w:r>
-    </w:p>
-    <w:p>
-      <w:pPr>
-        <w:rPr>
-          <w:rFonts w:ascii="Arial" w:hAnsi="Arial" w:cs="Arial"/>
-          <w:sz w:val="24"/>
-          <w:szCs w:val="24"/>
-        </w:rPr>
-      </w:pPr>
-      <w:proofErr w:type="spellStart"/>
-      <w:r>
-        <w:rPr>
-          <w:rFonts w:ascii="Arial" w:hAnsi="Arial" w:cs="Arial"/>
-          <w:sz w:val="24"/>
-          <w:szCs w:val="24"/>
-        </w:rPr>
-        <w:t>conteudo</w:t>
-      </w:r>
-      <w:proofErr w:type="spellEnd"/>
-      <w:r>
-        <w:rPr>
-          <w:rFonts w:ascii="Arial" w:hAnsi="Arial" w:cs="Arial"/>
-          <w:sz w:val="24"/>
-          <w:szCs w:val="24"/>
-        </w:rPr>
-        <w:t xml:space="preserve"> </w:t>
-      </w:r>
-      <w:proofErr w:type="gramStart"/>
-      <w:r>
-        <w:rPr>
-          <w:rFonts w:ascii="Arial" w:hAnsi="Arial" w:cs="Arial"/>
-          <w:sz w:val="24"/>
-          <w:szCs w:val="24"/>
-        </w:rPr>
-        <w:t>VARCHAR(</w:t>
-      </w:r>
-      <w:proofErr w:type="gramEnd"/>
-      <w:r>
-        <w:rPr>
-          <w:rFonts w:ascii="Arial" w:hAnsi="Arial" w:cs="Arial"/>
-          <w:sz w:val="24"/>
-          <w:szCs w:val="24"/>
-        </w:rPr>
-        <w:t>500),</w:t>
-      </w:r>
-    </w:p>
-    <w:p>
-      <w:pPr>
-        <w:rPr>
-          <w:rFonts w:ascii="Arial" w:hAnsi="Arial" w:cs="Arial"/>
-          <w:sz w:val="24"/>
-          <w:szCs w:val="24"/>
-        </w:rPr>
-      </w:pPr>
-      <w:proofErr w:type="spellStart"/>
-      <w:r>
-        <w:rPr>
-          <w:rFonts w:ascii="Arial" w:hAnsi="Arial" w:cs="Arial"/>
-          <w:sz w:val="24"/>
-          <w:szCs w:val="24"/>
-        </w:rPr>
-        <w:t>data_comentario</w:t>
-      </w:r>
-      <w:proofErr w:type="spellEnd"/>
-      <w:r>
-        <w:rPr>
-          <w:rFonts w:ascii="Arial" w:hAnsi="Arial" w:cs="Arial"/>
-          <w:sz w:val="24"/>
-          <w:szCs w:val="24"/>
-        </w:rPr>
-        <w:t xml:space="preserve"> DATE,</w:t>
-      </w:r>
-    </w:p>
-    <w:p>
-      <w:pPr>
-        <w:rPr>
-          <w:rFonts w:ascii="Arial" w:hAnsi="Arial" w:cs="Arial"/>
-          <w:sz w:val="24"/>
-          <w:szCs w:val="24"/>
-        </w:rPr>
-      </w:pPr>
-      <w:r>
-        <w:rPr>
-          <w:rFonts w:ascii="Arial" w:hAnsi="Arial" w:cs="Arial"/>
-          <w:sz w:val="24"/>
-          <w:szCs w:val="24"/>
-        </w:rPr>
-        <w:t>hora TIME</w:t>
-      </w:r>
-    </w:p>
-    <w:p>
-      <w:pPr>
-        <w:rPr>
-          <w:rFonts w:ascii="Arial" w:hAnsi="Arial" w:cs="Arial"/>
-          <w:sz w:val="24"/>
-          <w:szCs w:val="24"/>
-        </w:rPr>
-      </w:pPr>
-      <w:r>
-        <w:rPr>
-          <w:rFonts w:ascii="Arial" w:hAnsi="Arial" w:cs="Arial"/>
-          <w:sz w:val="24"/>
-          <w:szCs w:val="24"/>
-        </w:rPr>
-        <w:t>);</w:t>
-      </w:r>
-    </w:p>
-    <w:p>
-      <w:pPr>
-        <w:rPr>
-          <w:rFonts w:ascii="Arial" w:hAnsi="Arial" w:cs="Arial"/>
-          <w:sz w:val="24"/>
-          <w:szCs w:val="24"/>
-        </w:rPr>
-      </w:pPr>
-    </w:p>
-    <w:p>
-      <w:pPr>
-        <w:rPr>
-          <w:rFonts w:ascii="Arial" w:hAnsi="Arial" w:cs="Arial"/>
-          <w:sz w:val="24"/>
-          <w:szCs w:val="24"/>
-        </w:rPr>
-      </w:pPr>
-      <w:r>
-        <w:rPr>
-          <w:rFonts w:ascii="Arial" w:hAnsi="Arial" w:cs="Arial"/>
-          <w:sz w:val="24"/>
-          <w:szCs w:val="24"/>
-        </w:rPr>
-        <w:t xml:space="preserve">CREATE TABLE </w:t>
-      </w:r>
-      <w:proofErr w:type="gramStart"/>
-      <w:r>
-        <w:rPr>
-          <w:rFonts w:ascii="Arial" w:hAnsi="Arial" w:cs="Arial"/>
-          <w:sz w:val="24"/>
-          <w:szCs w:val="24"/>
-        </w:rPr>
-        <w:t>autor(</w:t>
-      </w:r>
-      <w:proofErr w:type="gramEnd"/>
+        <w:t xml:space="preserve"> INTEGER,</w:t>
+      </w:r>
     </w:p>
     <w:p>
       <w:pPr>
@@ -577,194 +754,7 @@
           <w:sz w:val="24"/>
           <w:szCs w:val="24"/>
         </w:rPr>
-        <w:t xml:space="preserve"> INTEGER PRIMARY KEY NOT NULL,</w:t>
-      </w:r>
-    </w:p>
-    <w:p>
-      <w:pPr>
-        <w:rPr>
-          <w:rFonts w:ascii="Arial" w:hAnsi="Arial" w:cs="Arial"/>
-          <w:sz w:val="24"/>
-          <w:szCs w:val="24"/>
-        </w:rPr>
-      </w:pPr>
-      <w:r>
-        <w:rPr>
-          <w:rFonts w:ascii="Arial" w:hAnsi="Arial" w:cs="Arial"/>
-          <w:sz w:val="24"/>
-          <w:szCs w:val="24"/>
-        </w:rPr>
-        <w:t xml:space="preserve">nome </w:t>
-      </w:r>
-      <w:proofErr w:type="gramStart"/>
-      <w:r>
-        <w:rPr>
-          <w:rFonts w:ascii="Arial" w:hAnsi="Arial" w:cs="Arial"/>
-          <w:sz w:val="24"/>
-          <w:szCs w:val="24"/>
-        </w:rPr>
-        <w:t>VARCHAR(</w:t>
-      </w:r>
-      <w:proofErr w:type="gramEnd"/>
-      <w:r>
-        <w:rPr>
-          <w:rFonts w:ascii="Arial" w:hAnsi="Arial" w:cs="Arial"/>
-          <w:sz w:val="24"/>
-          <w:szCs w:val="24"/>
-        </w:rPr>
-        <w:t>50),</w:t>
-      </w:r>
-    </w:p>
-    <w:p>
-      <w:pPr>
-        <w:rPr>
-          <w:rFonts w:ascii="Arial" w:hAnsi="Arial" w:cs="Arial"/>
-          <w:sz w:val="24"/>
-          <w:szCs w:val="24"/>
-        </w:rPr>
-      </w:pPr>
-      <w:proofErr w:type="spellStart"/>
-      <w:r>
-        <w:rPr>
-          <w:rFonts w:ascii="Arial" w:hAnsi="Arial" w:cs="Arial"/>
-          <w:sz w:val="24"/>
-          <w:szCs w:val="24"/>
-        </w:rPr>
-        <w:t>email</w:t>
-      </w:r>
-      <w:proofErr w:type="spellEnd"/>
-      <w:r>
-        <w:rPr>
-          <w:rFonts w:ascii="Arial" w:hAnsi="Arial" w:cs="Arial"/>
-          <w:sz w:val="24"/>
-          <w:szCs w:val="24"/>
-        </w:rPr>
-        <w:t xml:space="preserve"> </w:t>
-      </w:r>
-      <w:proofErr w:type="gramStart"/>
-      <w:r>
-        <w:rPr>
-          <w:rFonts w:ascii="Arial" w:hAnsi="Arial" w:cs="Arial"/>
-          <w:sz w:val="24"/>
-          <w:szCs w:val="24"/>
-        </w:rPr>
-        <w:t>VARCHAR(</w:t>
-      </w:r>
-      <w:proofErr w:type="gramEnd"/>
-      <w:r>
-        <w:rPr>
-          <w:rFonts w:ascii="Arial" w:hAnsi="Arial" w:cs="Arial"/>
-          <w:sz w:val="24"/>
-          <w:szCs w:val="24"/>
-        </w:rPr>
-        <w:t>100)</w:t>
-      </w:r>
-    </w:p>
-    <w:p>
-      <w:pPr>
-        <w:rPr>
-          <w:rFonts w:ascii="Arial" w:hAnsi="Arial" w:cs="Arial"/>
-          <w:sz w:val="24"/>
-          <w:szCs w:val="24"/>
-        </w:rPr>
-      </w:pPr>
-      <w:r>
-        <w:rPr>
-          <w:rFonts w:ascii="Arial" w:hAnsi="Arial" w:cs="Arial"/>
-          <w:sz w:val="24"/>
-          <w:szCs w:val="24"/>
-        </w:rPr>
-        <w:t>);</w:t>
-      </w:r>
-    </w:p>
-    <w:p>
-      <w:pPr>
-        <w:rPr>
-          <w:rFonts w:ascii="Arial" w:hAnsi="Arial" w:cs="Arial"/>
-          <w:sz w:val="24"/>
-          <w:szCs w:val="24"/>
-        </w:rPr>
-      </w:pPr>
-    </w:p>
-    <w:p>
-      <w:pPr>
-        <w:rPr>
-          <w:rFonts w:ascii="Arial" w:hAnsi="Arial" w:cs="Arial"/>
-          <w:sz w:val="24"/>
-          <w:szCs w:val="24"/>
-        </w:rPr>
-      </w:pPr>
-      <w:r>
-        <w:rPr>
-          <w:rFonts w:ascii="Arial" w:hAnsi="Arial" w:cs="Arial"/>
-          <w:sz w:val="24"/>
-          <w:szCs w:val="24"/>
-        </w:rPr>
-        <w:t xml:space="preserve">CREATE TABLE </w:t>
-      </w:r>
-      <w:proofErr w:type="gramStart"/>
-      <w:r>
-        <w:rPr>
-          <w:rFonts w:ascii="Arial" w:hAnsi="Arial" w:cs="Arial"/>
-          <w:sz w:val="24"/>
-          <w:szCs w:val="24"/>
-        </w:rPr>
-        <w:t>postagem(</w:t>
-      </w:r>
-      <w:proofErr w:type="gramEnd"/>
-    </w:p>
-    <w:p>
-      <w:pPr>
-        <w:rPr>
-          <w:rFonts w:ascii="Arial" w:hAnsi="Arial" w:cs="Arial"/>
-          <w:sz w:val="24"/>
-          <w:szCs w:val="24"/>
-        </w:rPr>
-      </w:pPr>
-      <w:proofErr w:type="spellStart"/>
-      <w:r>
-        <w:rPr>
-          <w:rFonts w:ascii="Arial" w:hAnsi="Arial" w:cs="Arial"/>
-          <w:sz w:val="24"/>
-          <w:szCs w:val="24"/>
-        </w:rPr>
-        <w:t>id_autor</w:t>
-      </w:r>
-      <w:proofErr w:type="spellEnd"/>
-      <w:r>
-        <w:rPr>
-          <w:rFonts w:ascii="Arial" w:hAnsi="Arial" w:cs="Arial"/>
-          <w:sz w:val="24"/>
-          <w:szCs w:val="24"/>
-        </w:rPr>
-        <w:t xml:space="preserve"> INTEGER NOT NULL,</w:t>
-      </w:r>
-    </w:p>
-    <w:p>
-      <w:pPr>
-        <w:rPr>
-          <w:rFonts w:ascii="Arial" w:hAnsi="Arial" w:cs="Arial"/>
-          <w:sz w:val="24"/>
-          <w:szCs w:val="24"/>
-        </w:rPr>
-      </w:pPr>
-      <w:proofErr w:type="spellStart"/>
-      <w:r>
-        <w:rPr>
-          <w:rFonts w:ascii="Arial" w:hAnsi="Arial" w:cs="Arial"/>
-          <w:sz w:val="24"/>
-          <w:szCs w:val="24"/>
-        </w:rPr>
-        <w:t>id_postagem</w:t>
-      </w:r>
-      <w:proofErr w:type="spellEnd"/>
-      <w:r>
-        <w:rPr>
-          <w:rFonts w:ascii="Arial" w:hAnsi="Arial" w:cs="Arial"/>
-          <w:sz w:val="24"/>
-          <w:szCs w:val="24"/>
-        </w:rPr>
-        <w:t xml:space="preserve"> INTEGER NOT NULL,</w:t>
+        <w:t xml:space="preserve"> INTEGER,</w:t>
       </w:r>
     </w:p>
     <w:p>
@@ -919,6 +909,159 @@
       </w:r>
       <w:bookmarkStart w:id="0" w:name="_GoBack"/>
       <w:bookmarkEnd w:id="0"/>
+    </w:p>
+    <w:p>
+      <w:pPr>
+        <w:rPr>
+          <w:rFonts w:ascii="Arial" w:hAnsi="Arial" w:cs="Arial"/>
+          <w:sz w:val="24"/>
+          <w:szCs w:val="24"/>
+        </w:rPr>
+      </w:pPr>
+      <w:proofErr w:type="spellStart"/>
+      <w:r>
+        <w:rPr>
+          <w:rFonts w:ascii="Arial" w:hAnsi="Arial" w:cs="Arial"/>
+          <w:sz w:val="24"/>
+          <w:szCs w:val="24"/>
+        </w:rPr>
+        <w:t>drop</w:t>
+      </w:r>
+      <w:proofErr w:type="spellEnd"/>
+      <w:r>
+        <w:rPr>
+          <w:rFonts w:ascii="Arial" w:hAnsi="Arial" w:cs="Arial"/>
+          <w:sz w:val="24"/>
+          <w:szCs w:val="24"/>
+        </w:rPr>
+        <w:t xml:space="preserve"> </w:t>
+      </w:r>
+      <w:proofErr w:type="spellStart"/>
+      <w:r>
+        <w:rPr>
+          <w:rFonts w:ascii="Arial" w:hAnsi="Arial" w:cs="Arial"/>
+          <w:sz w:val="24"/>
+          <w:szCs w:val="24"/>
+        </w:rPr>
+        <w:t>table</w:t>
+      </w:r>
+      <w:proofErr w:type="spellEnd"/>
+      <w:r>
+        <w:rPr>
+          <w:rFonts w:ascii="Arial" w:hAnsi="Arial" w:cs="Arial"/>
+          <w:sz w:val="24"/>
+          <w:szCs w:val="24"/>
+        </w:rPr>
+        <w:t xml:space="preserve"> </w:t>
+      </w:r>
+      <w:proofErr w:type="spellStart"/>
+      <w:r>
+        <w:rPr>
+          <w:rFonts w:ascii="Arial" w:hAnsi="Arial" w:cs="Arial"/>
+          <w:sz w:val="24"/>
+          <w:szCs w:val="24"/>
+        </w:rPr>
+        <w:t>comentario</w:t>
+      </w:r>
+      <w:proofErr w:type="spellEnd"/>
+      <w:r>
+        <w:rPr>
+          <w:rFonts w:ascii="Arial" w:hAnsi="Arial" w:cs="Arial"/>
+          <w:sz w:val="24"/>
+          <w:szCs w:val="24"/>
+        </w:rPr>
+        <w:t>;</w:t>
+      </w:r>
+    </w:p>
+    <w:p>
+      <w:pPr>
+        <w:rPr>
+          <w:rFonts w:ascii="Arial" w:hAnsi="Arial" w:cs="Arial"/>
+          <w:sz w:val="24"/>
+          <w:szCs w:val="24"/>
+        </w:rPr>
+      </w:pPr>
+      <w:proofErr w:type="spellStart"/>
+      <w:r>
+        <w:rPr>
+          <w:rFonts w:ascii="Arial" w:hAnsi="Arial" w:cs="Arial"/>
+          <w:sz w:val="24"/>
+          <w:szCs w:val="24"/>
+        </w:rPr>
+        <w:t>drop</w:t>
+      </w:r>
+      <w:proofErr w:type="spellEnd"/>
+      <w:r>
+        <w:rPr>
+          <w:rFonts w:ascii="Arial" w:hAnsi="Arial" w:cs="Arial"/>
+          <w:sz w:val="24"/>
+          <w:szCs w:val="24"/>
+        </w:rPr>
+        <w:t xml:space="preserve"> </w:t>
+      </w:r>
+      <w:proofErr w:type="spellStart"/>
+      <w:r>
+        <w:rPr>
+          <w:rFonts w:ascii="Arial" w:hAnsi="Arial" w:cs="Arial"/>
+          <w:sz w:val="24"/>
+          <w:szCs w:val="24"/>
+        </w:rPr>
+        <w:t>table</w:t>
+      </w:r>
+      <w:proofErr w:type="spellEnd"/>
+      <w:r>
+        <w:rPr>
+          <w:rFonts w:ascii="Arial" w:hAnsi="Arial" w:cs="Arial"/>
+          <w:sz w:val="24"/>
+          <w:szCs w:val="24"/>
+        </w:rPr>
+        <w:t xml:space="preserve"> autor;</w:t>
+      </w:r>
+    </w:p>
+    <w:p>
+      <w:pPr>
+        <w:rPr>
+          <w:rFonts w:ascii="Arial" w:hAnsi="Arial" w:cs="Arial"/>
+          <w:sz w:val="24"/>
+          <w:szCs w:val="24"/>
+        </w:rPr>
+      </w:pPr>
+      <w:proofErr w:type="spellStart"/>
+      <w:r>
+        <w:rPr>
+          <w:rFonts w:ascii="Arial" w:hAnsi="Arial" w:cs="Arial"/>
+          <w:sz w:val="24"/>
+          <w:szCs w:val="24"/>
+        </w:rPr>
+        <w:t>drop</w:t>
+      </w:r>
+      <w:proofErr w:type="spellEnd"/>
+      <w:r>
+        <w:rPr>
+          <w:rFonts w:ascii="Arial" w:hAnsi="Arial" w:cs="Arial"/>
+          <w:sz w:val="24"/>
+          <w:szCs w:val="24"/>
+        </w:rPr>
+        <w:t xml:space="preserve"> </w:t>
+      </w:r>
+      <w:proofErr w:type="spellStart"/>
+      <w:r>
+        <w:rPr>
+          <w:rFonts w:ascii="Arial" w:hAnsi="Arial" w:cs="Arial"/>
+          <w:sz w:val="24"/>
+          <w:szCs w:val="24"/>
+        </w:rPr>
+        <w:t>table</w:t>
+      </w:r>
+      <w:proofErr w:type="spellEnd"/>
+      <w:r>
+        <w:rPr>
+          <w:rFonts w:ascii="Arial" w:hAnsi="Arial" w:cs="Arial"/>
+          <w:sz w:val="24"/>
+          <w:szCs w:val="24"/>
+        </w:rPr>
+        <w:t xml:space="preserve"> postagem;</w:t>
+      </w:r>
     </w:p>
     <w:sectPr>
       <w:pgSz w:w="11906" w:h="16838"/>

</xml_diff>